<commit_message>
Update agenda format with latest margin-adjusted Word file
</commit_message>
<xml_diff>
--- a/public/one-off-requests/agenda format.docx
+++ b/public/one-off-requests/agenda format.docx
@@ -11,7 +11,7 @@
           <wp:anchor distT="0" distB="0" distL="0" distR="0" simplePos="0" relativeHeight="1" behindDoc="1" locked="0" layoutInCell="0" allowOverlap="1">
             <wp:simplePos x="0" y="0"/>
             <wp:positionH relativeFrom="page">
-              <wp:posOffset>6032500</wp:posOffset>
+              <wp:posOffset>8775700</wp:posOffset>
             </wp:positionH>
             <wp:positionV relativeFrom="page">
               <wp:posOffset>495300</wp:posOffset>
@@ -79,7 +79,7 @@
           <wp:anchor distT="0" distB="0" distL="0" distR="0" simplePos="0" relativeHeight="2" behindDoc="1" locked="0" layoutInCell="0" allowOverlap="1">
             <wp:simplePos x="0" y="0"/>
             <wp:positionH relativeFrom="page">
-              <wp:posOffset>6667500</wp:posOffset>
+              <wp:posOffset>9410700</wp:posOffset>
             </wp:positionH>
             <wp:positionV relativeFrom="page">
               <wp:posOffset>965200</wp:posOffset>
@@ -142,7 +142,7 @@
           <wp:anchor distT="0" distB="0" distL="0" distR="0" simplePos="0" relativeHeight="3" behindDoc="0" locked="0" layoutInCell="0" allowOverlap="1">
             <wp:simplePos x="0" y="0"/>
             <wp:positionH relativeFrom="page">
-              <wp:posOffset>304800</wp:posOffset>
+              <wp:posOffset>3048000</wp:posOffset>
             </wp:positionH>
             <wp:positionV relativeFrom="page">
               <wp:posOffset>191770</wp:posOffset>
@@ -207,7 +207,7 @@
           <wp:anchor distT="0" distB="0" distL="0" distR="0" simplePos="0" relativeHeight="4" behindDoc="1" locked="0" layoutInCell="0" allowOverlap="1">
             <wp:simplePos x="0" y="0"/>
             <wp:positionH relativeFrom="page">
-              <wp:posOffset>2190750</wp:posOffset>
+              <wp:posOffset>4933950</wp:posOffset>
             </wp:positionH>
             <wp:positionV relativeFrom="page">
               <wp:posOffset>243840</wp:posOffset>
@@ -252,7 +252,7 @@
           <wp:anchor distT="0" distB="0" distL="0" distR="0" simplePos="0" relativeHeight="5" behindDoc="0" locked="0" layoutInCell="0" allowOverlap="1">
             <wp:simplePos x="0" y="0"/>
             <wp:positionH relativeFrom="page">
-              <wp:posOffset>5702300</wp:posOffset>
+              <wp:posOffset>8445500</wp:posOffset>
             </wp:positionH>
             <wp:positionV relativeFrom="page">
               <wp:posOffset>191770</wp:posOffset>
@@ -317,7 +317,7 @@
           <wp:anchor distT="0" distB="0" distL="0" distR="0" simplePos="0" relativeHeight="6" behindDoc="0" locked="0" layoutInCell="0" allowOverlap="1">
             <wp:simplePos x="0" y="0"/>
             <wp:positionH relativeFrom="page">
-              <wp:posOffset>342900</wp:posOffset>
+              <wp:posOffset>3086100</wp:posOffset>
             </wp:positionH>
             <wp:positionV relativeFrom="page">
               <wp:posOffset>495300</wp:posOffset>
@@ -381,7 +381,7 @@
           <wp:anchor distT="0" distB="0" distL="0" distR="0" simplePos="0" relativeHeight="7" behindDoc="0" locked="0" layoutInCell="0" allowOverlap="1">
             <wp:simplePos x="0" y="0"/>
             <wp:positionH relativeFrom="page">
-              <wp:posOffset>342900</wp:posOffset>
+              <wp:posOffset>3086100</wp:posOffset>
             </wp:positionH>
             <wp:positionV relativeFrom="page">
               <wp:posOffset>876300</wp:posOffset>
@@ -445,7 +445,7 @@
           <wp:anchor distT="0" distB="0" distL="0" distR="0" simplePos="0" relativeHeight="8" behindDoc="0" locked="0" layoutInCell="0" allowOverlap="1">
             <wp:simplePos x="0" y="0"/>
             <wp:positionH relativeFrom="page">
-              <wp:posOffset>342900</wp:posOffset>
+              <wp:posOffset>3086100</wp:posOffset>
             </wp:positionH>
             <wp:positionV relativeFrom="page">
               <wp:posOffset>1221740</wp:posOffset>
@@ -509,7 +509,7 @@
           <wp:anchor distT="0" distB="0" distL="0" distR="0" simplePos="0" relativeHeight="9" behindDoc="1" locked="0" layoutInCell="0" allowOverlap="1">
             <wp:simplePos x="0" y="0"/>
             <wp:positionH relativeFrom="page">
-              <wp:posOffset>5524500</wp:posOffset>
+              <wp:posOffset>8267700</wp:posOffset>
             </wp:positionH>
             <wp:positionV relativeFrom="page">
               <wp:posOffset>666750</wp:posOffset>
@@ -554,7 +554,7 @@
           <wp:anchor distT="0" distB="0" distL="0" distR="0" simplePos="0" relativeHeight="10" behindDoc="0" locked="0" layoutInCell="0" allowOverlap="1">
             <wp:simplePos x="0" y="0"/>
             <wp:positionH relativeFrom="page">
-              <wp:posOffset>5854700</wp:posOffset>
+              <wp:posOffset>8597900</wp:posOffset>
             </wp:positionH>
             <wp:positionV relativeFrom="page">
               <wp:posOffset>731520</wp:posOffset>
@@ -637,7 +637,7 @@
           <wp:anchor distT="0" distB="0" distL="0" distR="0" simplePos="0" relativeHeight="11" behindDoc="1" locked="0" layoutInCell="0" allowOverlap="1">
             <wp:simplePos x="0" y="0"/>
             <wp:positionH relativeFrom="page">
-              <wp:posOffset>5861050</wp:posOffset>
+              <wp:posOffset>8604250</wp:posOffset>
             </wp:positionH>
             <wp:positionV relativeFrom="page">
               <wp:posOffset>1247140</wp:posOffset>
@@ -682,7 +682,7 @@
           <wp:anchor distT="0" distB="0" distL="0" distR="0" simplePos="0" relativeHeight="12" behindDoc="1" locked="0" layoutInCell="0" allowOverlap="1">
             <wp:simplePos x="0" y="0"/>
             <wp:positionH relativeFrom="page">
-              <wp:posOffset>254000</wp:posOffset>
+              <wp:posOffset>2997200</wp:posOffset>
             </wp:positionH>
             <wp:positionV relativeFrom="page">
               <wp:posOffset>1600200</wp:posOffset>
@@ -727,7 +727,7 @@
           <wp:anchor distT="0" distB="0" distL="0" distR="0" simplePos="0" relativeHeight="13" behindDoc="0" locked="0" layoutInCell="0" allowOverlap="1">
             <wp:simplePos x="0" y="0"/>
             <wp:positionH relativeFrom="page">
-              <wp:posOffset>419100</wp:posOffset>
+              <wp:posOffset>3162300</wp:posOffset>
             </wp:positionH>
             <wp:positionV relativeFrom="page">
               <wp:posOffset>1860550</wp:posOffset>
@@ -812,7 +812,7 @@
           <wp:anchor distT="0" distB="0" distL="0" distR="0" simplePos="0" relativeHeight="14" behindDoc="1" locked="0" layoutInCell="0" allowOverlap="1">
             <wp:simplePos x="0" y="0"/>
             <wp:positionH relativeFrom="page">
-              <wp:posOffset>1898650</wp:posOffset>
+              <wp:posOffset>4641850</wp:posOffset>
             </wp:positionH>
             <wp:positionV relativeFrom="page">
               <wp:posOffset>1733550</wp:posOffset>
@@ -857,7 +857,7 @@
           <wp:anchor distT="0" distB="0" distL="0" distR="0" simplePos="0" relativeHeight="15" behindDoc="1" locked="0" layoutInCell="0" allowOverlap="1">
             <wp:simplePos x="0" y="0"/>
             <wp:positionH relativeFrom="page">
-              <wp:posOffset>3708400</wp:posOffset>
+              <wp:posOffset>6451600</wp:posOffset>
             </wp:positionH>
             <wp:positionV relativeFrom="page">
               <wp:posOffset>1733550</wp:posOffset>
@@ -902,7 +902,7 @@
           <wp:anchor distT="0" distB="0" distL="0" distR="0" simplePos="0" relativeHeight="16" behindDoc="1" locked="0" layoutInCell="0" allowOverlap="1">
             <wp:simplePos x="0" y="0"/>
             <wp:positionH relativeFrom="page">
-              <wp:posOffset>5568950</wp:posOffset>
+              <wp:posOffset>8312150</wp:posOffset>
             </wp:positionH>
             <wp:positionV relativeFrom="page">
               <wp:posOffset>1733550</wp:posOffset>
@@ -947,7 +947,7 @@
           <wp:anchor distT="0" distB="0" distL="0" distR="0" simplePos="0" relativeHeight="17" behindDoc="0" locked="0" layoutInCell="0" allowOverlap="1">
             <wp:simplePos x="0" y="0"/>
             <wp:positionH relativeFrom="page">
-              <wp:posOffset>2019300</wp:posOffset>
+              <wp:posOffset>4762500</wp:posOffset>
             </wp:positionH>
             <wp:positionV relativeFrom="page">
               <wp:posOffset>1604010</wp:posOffset>
@@ -970,7 +970,7 @@
           <wp:anchor distT="0" distB="0" distL="0" distR="0" simplePos="0" relativeHeight="18" behindDoc="0" locked="0" layoutInCell="0" allowOverlap="1">
             <wp:simplePos x="0" y="0"/>
             <wp:positionH relativeFrom="page">
-              <wp:posOffset>2622550</wp:posOffset>
+              <wp:posOffset>5365750</wp:posOffset>
             </wp:positionH>
             <wp:positionV relativeFrom="page">
               <wp:posOffset>1752600</wp:posOffset>
@@ -1053,7 +1053,7 @@
           <wp:anchor distT="0" distB="0" distL="0" distR="0" simplePos="0" relativeHeight="19" behindDoc="0" locked="0" layoutInCell="0" allowOverlap="1">
             <wp:simplePos x="0" y="0"/>
             <wp:positionH relativeFrom="page">
-              <wp:posOffset>2622550</wp:posOffset>
+              <wp:posOffset>5365750</wp:posOffset>
             </wp:positionH>
             <wp:positionV relativeFrom="page">
               <wp:posOffset>2070100</wp:posOffset>
@@ -1117,7 +1117,7 @@
           <wp:anchor distT="0" distB="0" distL="0" distR="0" simplePos="0" relativeHeight="20" behindDoc="0" locked="0" layoutInCell="0" allowOverlap="1">
             <wp:simplePos x="0" y="0"/>
             <wp:positionH relativeFrom="page">
-              <wp:posOffset>3759200</wp:posOffset>
+              <wp:posOffset>6502400</wp:posOffset>
             </wp:positionH>
             <wp:positionV relativeFrom="page">
               <wp:posOffset>1604010</wp:posOffset>
@@ -1140,7 +1140,7 @@
           <wp:anchor distT="0" distB="0" distL="0" distR="0" simplePos="0" relativeHeight="21" behindDoc="0" locked="0" layoutInCell="0" allowOverlap="1">
             <wp:simplePos x="0" y="0"/>
             <wp:positionH relativeFrom="page">
-              <wp:posOffset>4368800</wp:posOffset>
+              <wp:posOffset>7112000</wp:posOffset>
             </wp:positionH>
             <wp:positionV relativeFrom="page">
               <wp:posOffset>1752600</wp:posOffset>
@@ -1223,7 +1223,7 @@
           <wp:anchor distT="0" distB="0" distL="0" distR="0" simplePos="0" relativeHeight="22" behindDoc="0" locked="0" layoutInCell="0" allowOverlap="1">
             <wp:simplePos x="0" y="0"/>
             <wp:positionH relativeFrom="page">
-              <wp:posOffset>4368800</wp:posOffset>
+              <wp:posOffset>7112000</wp:posOffset>
             </wp:positionH>
             <wp:positionV relativeFrom="page">
               <wp:posOffset>2070100</wp:posOffset>
@@ -1288,7 +1288,7 @@
           <wp:anchor distT="0" distB="0" distL="0" distR="0" simplePos="0" relativeHeight="23" behindDoc="0" locked="0" layoutInCell="0" allowOverlap="1">
             <wp:simplePos x="0" y="0"/>
             <wp:positionH relativeFrom="page">
-              <wp:posOffset>5619750</wp:posOffset>
+              <wp:posOffset>8362950</wp:posOffset>
             </wp:positionH>
             <wp:positionV relativeFrom="page">
               <wp:posOffset>1604010</wp:posOffset>
@@ -1311,7 +1311,7 @@
           <wp:anchor distT="0" distB="0" distL="0" distR="0" simplePos="0" relativeHeight="24" behindDoc="0" locked="0" layoutInCell="0" allowOverlap="1">
             <wp:simplePos x="0" y="0"/>
             <wp:positionH relativeFrom="page">
-              <wp:posOffset>6223000</wp:posOffset>
+              <wp:posOffset>8966200</wp:posOffset>
             </wp:positionH>
             <wp:positionV relativeFrom="page">
               <wp:posOffset>1752600</wp:posOffset>
@@ -1394,7 +1394,7 @@
           <wp:anchor distT="0" distB="0" distL="0" distR="0" simplePos="0" relativeHeight="25" behindDoc="0" locked="0" layoutInCell="0" allowOverlap="1">
             <wp:simplePos x="0" y="0"/>
             <wp:positionH relativeFrom="page">
-              <wp:posOffset>6223000</wp:posOffset>
+              <wp:posOffset>8966200</wp:posOffset>
             </wp:positionH>
             <wp:positionV relativeFrom="page">
               <wp:posOffset>2070100</wp:posOffset>
@@ -1458,7 +1458,7 @@
           <wp:anchor distT="0" distB="0" distL="0" distR="0" simplePos="0" relativeHeight="26" behindDoc="1" locked="0" layoutInCell="0" allowOverlap="1">
             <wp:simplePos x="0" y="0"/>
             <wp:positionH relativeFrom="page">
-              <wp:posOffset>254000</wp:posOffset>
+              <wp:posOffset>2997200</wp:posOffset>
             </wp:positionH>
             <wp:positionV relativeFrom="page">
               <wp:posOffset>2514600</wp:posOffset>
@@ -1549,7 +1549,7 @@
           <wp:anchor distT="0" distB="0" distL="0" distR="0" simplePos="0" relativeHeight="27" behindDoc="1" locked="0" layoutInCell="0" allowOverlap="1">
             <wp:simplePos x="0" y="0"/>
             <wp:positionH relativeFrom="page">
-              <wp:posOffset>254000</wp:posOffset>
+              <wp:posOffset>2997200</wp:posOffset>
             </wp:positionH>
             <wp:positionV relativeFrom="page">
               <wp:posOffset>2895600</wp:posOffset>
@@ -1621,7 +1621,7 @@
           <wp:anchor distT="0" distB="0" distL="0" distR="0" simplePos="0" relativeHeight="28" behindDoc="1" locked="0" layoutInCell="0" allowOverlap="1">
             <wp:simplePos x="0" y="0"/>
             <wp:positionH relativeFrom="page">
-              <wp:posOffset>254000</wp:posOffset>
+              <wp:posOffset>2997200</wp:posOffset>
             </wp:positionH>
             <wp:positionV relativeFrom="page">
               <wp:posOffset>2514600</wp:posOffset>
@@ -1698,7 +1698,7 @@
           <wp:anchor distT="0" distB="0" distL="0" distR="0" simplePos="0" relativeHeight="29" behindDoc="0" locked="0" layoutInCell="0" allowOverlap="1">
             <wp:simplePos x="0" y="0"/>
             <wp:positionH relativeFrom="page">
-              <wp:posOffset>482600</wp:posOffset>
+              <wp:posOffset>3225800</wp:posOffset>
             </wp:positionH>
             <wp:positionV relativeFrom="page">
               <wp:posOffset>2606040</wp:posOffset>
@@ -1774,7 +1774,7 @@
           <wp:anchor distT="0" distB="0" distL="0" distR="0" simplePos="0" relativeHeight="30" behindDoc="0" locked="0" layoutInCell="0" allowOverlap="1">
             <wp:simplePos x="0" y="0"/>
             <wp:positionH relativeFrom="page">
-              <wp:posOffset>5664200</wp:posOffset>
+              <wp:posOffset>8407400</wp:posOffset>
             </wp:positionH>
             <wp:positionV relativeFrom="page">
               <wp:posOffset>2630170</wp:posOffset>
@@ -1838,7 +1838,7 @@
           <wp:anchor distT="0" distB="0" distL="0" distR="0" simplePos="0" relativeHeight="31" behindDoc="0" locked="0" layoutInCell="0" allowOverlap="1">
             <wp:simplePos x="0" y="0"/>
             <wp:positionH relativeFrom="page">
-              <wp:posOffset>438150</wp:posOffset>
+              <wp:posOffset>3181350</wp:posOffset>
             </wp:positionH>
             <wp:positionV relativeFrom="page">
               <wp:posOffset>3111500</wp:posOffset>
@@ -1902,7 +1902,7 @@
           <wp:anchor distT="0" distB="0" distL="0" distR="0" simplePos="0" relativeHeight="32" behindDoc="0" locked="0" layoutInCell="0" allowOverlap="1">
             <wp:simplePos x="0" y="0"/>
             <wp:positionH relativeFrom="page">
-              <wp:posOffset>1854200</wp:posOffset>
+              <wp:posOffset>4597400</wp:posOffset>
             </wp:positionH>
             <wp:positionV relativeFrom="page">
               <wp:posOffset>3009900</wp:posOffset>
@@ -2023,7 +2023,7 @@
           <wp:anchor distT="0" distB="0" distL="0" distR="0" simplePos="0" relativeHeight="37" behindDoc="0" locked="0" layoutInCell="0" allowOverlap="1">
             <wp:simplePos x="0" y="0"/>
             <wp:positionH relativeFrom="page">
-              <wp:posOffset>2495550</wp:posOffset>
+              <wp:posOffset>5238750</wp:posOffset>
             </wp:positionH>
             <wp:positionV relativeFrom="page">
               <wp:posOffset>2964180</wp:posOffset>
@@ -2159,7 +2159,7 @@
           <wp:anchor distT="0" distB="0" distL="0" distR="0" simplePos="0" relativeHeight="38" behindDoc="1" locked="0" layoutInCell="0" allowOverlap="1">
             <wp:simplePos x="0" y="0"/>
             <wp:positionH relativeFrom="page">
-              <wp:posOffset>254000</wp:posOffset>
+              <wp:posOffset>2997200</wp:posOffset>
             </wp:positionH>
             <wp:positionV relativeFrom="page">
               <wp:posOffset>3505200</wp:posOffset>
@@ -2204,7 +2204,7 @@
           <wp:anchor distT="0" distB="0" distL="0" distR="0" simplePos="0" relativeHeight="39" behindDoc="0" locked="0" layoutInCell="0" allowOverlap="1">
             <wp:simplePos x="0" y="0"/>
             <wp:positionH relativeFrom="page">
-              <wp:posOffset>438150</wp:posOffset>
+              <wp:posOffset>3181350</wp:posOffset>
             </wp:positionH>
             <wp:positionV relativeFrom="page">
               <wp:posOffset>3813175</wp:posOffset>
@@ -2269,7 +2269,7 @@
           <wp:anchor distT="0" distB="0" distL="0" distR="0" simplePos="0" relativeHeight="40" behindDoc="0" locked="0" layoutInCell="0" allowOverlap="1">
             <wp:simplePos x="0" y="0"/>
             <wp:positionH relativeFrom="page">
-              <wp:posOffset>1854200</wp:posOffset>
+              <wp:posOffset>4597400</wp:posOffset>
             </wp:positionH>
             <wp:positionV relativeFrom="page">
               <wp:posOffset>3800475</wp:posOffset>
@@ -2390,7 +2390,7 @@
           <wp:anchor distT="0" distB="0" distL="0" distR="0" simplePos="0" relativeHeight="45" behindDoc="0" locked="0" layoutInCell="0" allowOverlap="1">
             <wp:simplePos x="0" y="0"/>
             <wp:positionH relativeFrom="page">
-              <wp:posOffset>2495550</wp:posOffset>
+              <wp:posOffset>5238750</wp:posOffset>
             </wp:positionH>
             <wp:positionV relativeFrom="page">
               <wp:posOffset>3602355</wp:posOffset>
@@ -2598,7 +2598,7 @@
           <wp:anchor distT="0" distB="0" distL="0" distR="0" simplePos="0" relativeHeight="46" behindDoc="1" locked="0" layoutInCell="0" allowOverlap="1">
             <wp:simplePos x="0" y="0"/>
             <wp:positionH relativeFrom="page">
-              <wp:posOffset>254000</wp:posOffset>
+              <wp:posOffset>2997200</wp:posOffset>
             </wp:positionH>
             <wp:positionV relativeFrom="page">
               <wp:posOffset>4476750</wp:posOffset>
@@ -2641,7 +2641,7 @@
           <wp:anchor distT="0" distB="0" distL="0" distR="0" simplePos="0" relativeHeight="47" behindDoc="1" locked="0" layoutInCell="0" allowOverlap="1">
             <wp:simplePos x="0" y="0"/>
             <wp:positionH relativeFrom="page">
-              <wp:posOffset>254000</wp:posOffset>
+              <wp:posOffset>2997200</wp:posOffset>
             </wp:positionH>
             <wp:positionV relativeFrom="page">
               <wp:posOffset>4476750</wp:posOffset>
@@ -2684,7 +2684,7 @@
           <wp:anchor distT="0" distB="0" distL="0" distR="0" simplePos="0" relativeHeight="48" behindDoc="1" locked="0" layoutInCell="0" allowOverlap="1">
             <wp:simplePos x="0" y="0"/>
             <wp:positionH relativeFrom="page">
-              <wp:posOffset>254000</wp:posOffset>
+              <wp:posOffset>2997200</wp:posOffset>
             </wp:positionH>
             <wp:positionV relativeFrom="page">
               <wp:posOffset>4476750</wp:posOffset>
@@ -2729,7 +2729,7 @@
           <wp:anchor distT="0" distB="0" distL="0" distR="0" simplePos="0" relativeHeight="49" behindDoc="0" locked="0" layoutInCell="0" allowOverlap="1">
             <wp:simplePos x="0" y="0"/>
             <wp:positionH relativeFrom="page">
-              <wp:posOffset>438150</wp:posOffset>
+              <wp:posOffset>3181350</wp:posOffset>
             </wp:positionH>
             <wp:positionV relativeFrom="page">
               <wp:posOffset>4597400</wp:posOffset>
@@ -2793,7 +2793,7 @@
           <wp:anchor distT="0" distB="0" distL="0" distR="0" simplePos="0" relativeHeight="50" behindDoc="0" locked="0" layoutInCell="0" allowOverlap="1">
             <wp:simplePos x="0" y="0"/>
             <wp:positionH relativeFrom="page">
-              <wp:posOffset>1879600</wp:posOffset>
+              <wp:posOffset>4622800</wp:posOffset>
             </wp:positionH>
             <wp:positionV relativeFrom="page">
               <wp:posOffset>4521200</wp:posOffset>
@@ -2917,7 +2917,7 @@
           <wp:anchor distT="0" distB="0" distL="0" distR="0" simplePos="0" relativeHeight="53" behindDoc="0" locked="0" layoutInCell="0" allowOverlap="1">
             <wp:simplePos x="0" y="0"/>
             <wp:positionH relativeFrom="page">
-              <wp:posOffset>2495550</wp:posOffset>
+              <wp:posOffset>5238750</wp:posOffset>
             </wp:positionH>
             <wp:positionV relativeFrom="page">
               <wp:posOffset>4601210</wp:posOffset>
@@ -2981,7 +2981,7 @@
           <wp:anchor distT="0" distB="0" distL="0" distR="0" simplePos="0" relativeHeight="54" behindDoc="1" locked="0" layoutInCell="0" allowOverlap="1">
             <wp:simplePos x="0" y="0"/>
             <wp:positionH relativeFrom="page">
-              <wp:posOffset>254000</wp:posOffset>
+              <wp:posOffset>2997200</wp:posOffset>
             </wp:positionH>
             <wp:positionV relativeFrom="page">
               <wp:posOffset>4895850</wp:posOffset>
@@ -3026,7 +3026,7 @@
           <wp:anchor distT="0" distB="0" distL="0" distR="0" simplePos="0" relativeHeight="55" behindDoc="0" locked="0" layoutInCell="0" allowOverlap="1">
             <wp:simplePos x="0" y="0"/>
             <wp:positionH relativeFrom="page">
-              <wp:posOffset>438150</wp:posOffset>
+              <wp:posOffset>3181350</wp:posOffset>
             </wp:positionH>
             <wp:positionV relativeFrom="page">
               <wp:posOffset>5226050</wp:posOffset>
@@ -3090,7 +3090,7 @@
           <wp:anchor distT="0" distB="0" distL="0" distR="0" simplePos="0" relativeHeight="56" behindDoc="0" locked="0" layoutInCell="0" allowOverlap="1">
             <wp:simplePos x="0" y="0"/>
             <wp:positionH relativeFrom="page">
-              <wp:posOffset>1854200</wp:posOffset>
+              <wp:posOffset>4597400</wp:posOffset>
             </wp:positionH>
             <wp:positionV relativeFrom="page">
               <wp:posOffset>5124450</wp:posOffset>
@@ -3211,7 +3211,7 @@
           <wp:anchor distT="0" distB="0" distL="0" distR="0" simplePos="0" relativeHeight="61" behindDoc="0" locked="0" layoutInCell="0" allowOverlap="1">
             <wp:simplePos x="0" y="0"/>
             <wp:positionH relativeFrom="page">
-              <wp:posOffset>2495550</wp:posOffset>
+              <wp:posOffset>5238750</wp:posOffset>
             </wp:positionH>
             <wp:positionV relativeFrom="page">
               <wp:posOffset>5002530</wp:posOffset>
@@ -3383,7 +3383,7 @@
           <wp:anchor distT="0" distB="0" distL="0" distR="0" simplePos="0" relativeHeight="62" behindDoc="1" locked="0" layoutInCell="0" allowOverlap="1">
             <wp:simplePos x="0" y="0"/>
             <wp:positionH relativeFrom="page">
-              <wp:posOffset>254000</wp:posOffset>
+              <wp:posOffset>2997200</wp:posOffset>
             </wp:positionH>
             <wp:positionV relativeFrom="page">
               <wp:posOffset>5734050</wp:posOffset>
@@ -3428,7 +3428,7 @@
           <wp:anchor distT="0" distB="0" distL="0" distR="0" simplePos="0" relativeHeight="63" behindDoc="0" locked="0" layoutInCell="0" allowOverlap="1">
             <wp:simplePos x="0" y="0"/>
             <wp:positionH relativeFrom="page">
-              <wp:posOffset>438150</wp:posOffset>
+              <wp:posOffset>3181350</wp:posOffset>
             </wp:positionH>
             <wp:positionV relativeFrom="page">
               <wp:posOffset>5864225</wp:posOffset>
@@ -3492,7 +3492,7 @@
           <wp:anchor distT="0" distB="0" distL="0" distR="0" simplePos="0" relativeHeight="64" behindDoc="0" locked="0" layoutInCell="0" allowOverlap="1">
             <wp:simplePos x="0" y="0"/>
             <wp:positionH relativeFrom="page">
-              <wp:posOffset>1854200</wp:posOffset>
+              <wp:posOffset>4597400</wp:posOffset>
             </wp:positionH>
             <wp:positionV relativeFrom="page">
               <wp:posOffset>5762625</wp:posOffset>
@@ -3748,7 +3748,7 @@
           <wp:anchor distT="0" distB="0" distL="0" distR="0" simplePos="0" relativeHeight="68" behindDoc="0" locked="0" layoutInCell="0" allowOverlap="1">
             <wp:simplePos x="0" y="0"/>
             <wp:positionH relativeFrom="page">
-              <wp:posOffset>2495550</wp:posOffset>
+              <wp:posOffset>5238750</wp:posOffset>
             </wp:positionH>
             <wp:positionV relativeFrom="page">
               <wp:posOffset>5868035</wp:posOffset>
@@ -3812,7 +3812,7 @@
           <wp:anchor distT="0" distB="0" distL="0" distR="0" simplePos="0" relativeHeight="69" behindDoc="1" locked="0" layoutInCell="0" allowOverlap="1">
             <wp:simplePos x="0" y="0"/>
             <wp:positionH relativeFrom="page">
-              <wp:posOffset>254000</wp:posOffset>
+              <wp:posOffset>2997200</wp:posOffset>
             </wp:positionH>
             <wp:positionV relativeFrom="page">
               <wp:posOffset>6172200</wp:posOffset>
@@ -3857,7 +3857,7 @@
           <wp:anchor distT="0" distB="0" distL="0" distR="0" simplePos="0" relativeHeight="70" behindDoc="0" locked="0" layoutInCell="0" allowOverlap="1">
             <wp:simplePos x="0" y="0"/>
             <wp:positionH relativeFrom="page">
-              <wp:posOffset>438150</wp:posOffset>
+              <wp:posOffset>3181350</wp:posOffset>
             </wp:positionH>
             <wp:positionV relativeFrom="page">
               <wp:posOffset>6311900</wp:posOffset>
@@ -3921,7 +3921,7 @@
           <wp:anchor distT="0" distB="0" distL="0" distR="0" simplePos="0" relativeHeight="71" behindDoc="0" locked="0" layoutInCell="0" allowOverlap="1">
             <wp:simplePos x="0" y="0"/>
             <wp:positionH relativeFrom="page">
-              <wp:posOffset>1854200</wp:posOffset>
+              <wp:posOffset>4597400</wp:posOffset>
             </wp:positionH>
             <wp:positionV relativeFrom="page">
               <wp:posOffset>6210300</wp:posOffset>
@@ -4177,7 +4177,7 @@
           <wp:anchor distT="0" distB="0" distL="0" distR="0" simplePos="0" relativeHeight="75" behindDoc="0" locked="0" layoutInCell="0" allowOverlap="1">
             <wp:simplePos x="0" y="0"/>
             <wp:positionH relativeFrom="page">
-              <wp:posOffset>2495550</wp:posOffset>
+              <wp:posOffset>5238750</wp:posOffset>
             </wp:positionH>
             <wp:positionV relativeFrom="page">
               <wp:posOffset>6315710</wp:posOffset>
@@ -4241,7 +4241,7 @@
           <wp:anchor distT="0" distB="0" distL="0" distR="0" simplePos="0" relativeHeight="76" behindDoc="1" locked="0" layoutInCell="0" allowOverlap="1">
             <wp:simplePos x="0" y="0"/>
             <wp:positionH relativeFrom="page">
-              <wp:posOffset>254000</wp:posOffset>
+              <wp:posOffset>2997200</wp:posOffset>
             </wp:positionH>
             <wp:positionV relativeFrom="page">
               <wp:posOffset>6750050</wp:posOffset>
@@ -4332,7 +4332,7 @@
           <wp:anchor distT="0" distB="0" distL="0" distR="0" simplePos="0" relativeHeight="77" behindDoc="1" locked="0" layoutInCell="0" allowOverlap="1">
             <wp:simplePos x="0" y="0"/>
             <wp:positionH relativeFrom="page">
-              <wp:posOffset>254000</wp:posOffset>
+              <wp:posOffset>2997200</wp:posOffset>
             </wp:positionH>
             <wp:positionV relativeFrom="page">
               <wp:posOffset>7131050</wp:posOffset>
@@ -4404,7 +4404,7 @@
           <wp:anchor distT="0" distB="0" distL="0" distR="0" simplePos="0" relativeHeight="78" behindDoc="1" locked="0" layoutInCell="0" allowOverlap="1">
             <wp:simplePos x="0" y="0"/>
             <wp:positionH relativeFrom="page">
-              <wp:posOffset>254000</wp:posOffset>
+              <wp:posOffset>2997200</wp:posOffset>
             </wp:positionH>
             <wp:positionV relativeFrom="page">
               <wp:posOffset>6750050</wp:posOffset>
@@ -4481,7 +4481,7 @@
           <wp:anchor distT="0" distB="0" distL="0" distR="0" simplePos="0" relativeHeight="79" behindDoc="0" locked="0" layoutInCell="0" allowOverlap="1">
             <wp:simplePos x="0" y="0"/>
             <wp:positionH relativeFrom="page">
-              <wp:posOffset>482600</wp:posOffset>
+              <wp:posOffset>3225800</wp:posOffset>
             </wp:positionH>
             <wp:positionV relativeFrom="page">
               <wp:posOffset>6841490</wp:posOffset>
@@ -4557,7 +4557,7 @@
           <wp:anchor distT="0" distB="0" distL="0" distR="0" simplePos="0" relativeHeight="80" behindDoc="0" locked="0" layoutInCell="0" allowOverlap="1">
             <wp:simplePos x="0" y="0"/>
             <wp:positionH relativeFrom="page">
-              <wp:posOffset>5664200</wp:posOffset>
+              <wp:posOffset>8407400</wp:posOffset>
             </wp:positionH>
             <wp:positionV relativeFrom="page">
               <wp:posOffset>6865620</wp:posOffset>
@@ -4621,7 +4621,7 @@
           <wp:anchor distT="0" distB="0" distL="0" distR="0" simplePos="0" relativeHeight="81" behindDoc="0" locked="0" layoutInCell="0" allowOverlap="1">
             <wp:simplePos x="0" y="0"/>
             <wp:positionH relativeFrom="page">
-              <wp:posOffset>438150</wp:posOffset>
+              <wp:posOffset>3181350</wp:posOffset>
             </wp:positionH>
             <wp:positionV relativeFrom="page">
               <wp:posOffset>7254875</wp:posOffset>
@@ -4685,7 +4685,7 @@
           <wp:anchor distT="0" distB="0" distL="0" distR="0" simplePos="0" relativeHeight="82" behindDoc="0" locked="0" layoutInCell="0" allowOverlap="1">
             <wp:simplePos x="0" y="0"/>
             <wp:positionH relativeFrom="page">
-              <wp:posOffset>1854200</wp:posOffset>
+              <wp:posOffset>4597400</wp:posOffset>
             </wp:positionH>
             <wp:positionV relativeFrom="page">
               <wp:posOffset>7153275</wp:posOffset>
@@ -4941,7 +4941,7 @@
           <wp:anchor distT="0" distB="0" distL="0" distR="0" simplePos="0" relativeHeight="86" behindDoc="0" locked="0" layoutInCell="0" allowOverlap="1">
             <wp:simplePos x="0" y="0"/>
             <wp:positionH relativeFrom="page">
-              <wp:posOffset>2495550</wp:posOffset>
+              <wp:posOffset>5238750</wp:posOffset>
             </wp:positionH>
             <wp:positionV relativeFrom="page">
               <wp:posOffset>7258685</wp:posOffset>
@@ -5005,7 +5005,7 @@
           <wp:anchor distT="0" distB="0" distL="0" distR="0" simplePos="0" relativeHeight="87" behindDoc="1" locked="0" layoutInCell="0" allowOverlap="1">
             <wp:simplePos x="0" y="0"/>
             <wp:positionH relativeFrom="page">
-              <wp:posOffset>254000</wp:posOffset>
+              <wp:posOffset>2997200</wp:posOffset>
             </wp:positionH>
             <wp:positionV relativeFrom="page">
               <wp:posOffset>7556500</wp:posOffset>
@@ -5050,7 +5050,7 @@
           <wp:anchor distT="0" distB="0" distL="0" distR="0" simplePos="0" relativeHeight="88" behindDoc="0" locked="0" layoutInCell="0" allowOverlap="1">
             <wp:simplePos x="0" y="0"/>
             <wp:positionH relativeFrom="page">
-              <wp:posOffset>438150</wp:posOffset>
+              <wp:posOffset>3181350</wp:posOffset>
             </wp:positionH>
             <wp:positionV relativeFrom="page">
               <wp:posOffset>7677150</wp:posOffset>
@@ -5114,7 +5114,7 @@
           <wp:anchor distT="0" distB="0" distL="0" distR="0" simplePos="0" relativeHeight="89" behindDoc="0" locked="0" layoutInCell="0" allowOverlap="1">
             <wp:simplePos x="0" y="0"/>
             <wp:positionH relativeFrom="page">
-              <wp:posOffset>1854200</wp:posOffset>
+              <wp:posOffset>4597400</wp:posOffset>
             </wp:positionH>
             <wp:positionV relativeFrom="page">
               <wp:posOffset>7575550</wp:posOffset>
@@ -5370,7 +5370,7 @@
           <wp:anchor distT="0" distB="0" distL="0" distR="0" simplePos="0" relativeHeight="93" behindDoc="0" locked="0" layoutInCell="0" allowOverlap="1">
             <wp:simplePos x="0" y="0"/>
             <wp:positionH relativeFrom="page">
-              <wp:posOffset>2495550</wp:posOffset>
+              <wp:posOffset>5238750</wp:posOffset>
             </wp:positionH>
             <wp:positionV relativeFrom="page">
               <wp:posOffset>7680960</wp:posOffset>
@@ -5434,7 +5434,7 @@
           <wp:anchor distT="0" distB="0" distL="0" distR="0" simplePos="0" relativeHeight="94" behindDoc="1" locked="0" layoutInCell="0" allowOverlap="1">
             <wp:simplePos x="0" y="0"/>
             <wp:positionH relativeFrom="page">
-              <wp:posOffset>254000</wp:posOffset>
+              <wp:posOffset>2997200</wp:posOffset>
             </wp:positionH>
             <wp:positionV relativeFrom="page">
               <wp:posOffset>7975600</wp:posOffset>
@@ -5479,7 +5479,7 @@
           <wp:anchor distT="0" distB="0" distL="0" distR="0" simplePos="0" relativeHeight="95" behindDoc="0" locked="0" layoutInCell="0" allowOverlap="1">
             <wp:simplePos x="0" y="0"/>
             <wp:positionH relativeFrom="page">
-              <wp:posOffset>438150</wp:posOffset>
+              <wp:posOffset>3181350</wp:posOffset>
             </wp:positionH>
             <wp:positionV relativeFrom="page">
               <wp:posOffset>8207375</wp:posOffset>
@@ -5543,7 +5543,7 @@
           <wp:anchor distT="0" distB="0" distL="0" distR="0" simplePos="0" relativeHeight="96" behindDoc="0" locked="0" layoutInCell="0" allowOverlap="1">
             <wp:simplePos x="0" y="0"/>
             <wp:positionH relativeFrom="page">
-              <wp:posOffset>1854200</wp:posOffset>
+              <wp:posOffset>4597400</wp:posOffset>
             </wp:positionH>
             <wp:positionV relativeFrom="page">
               <wp:posOffset>8105775</wp:posOffset>
@@ -5664,7 +5664,7 @@
           <wp:anchor distT="0" distB="0" distL="0" distR="0" simplePos="0" relativeHeight="99" behindDoc="0" locked="0" layoutInCell="0" allowOverlap="1">
             <wp:simplePos x="0" y="0"/>
             <wp:positionH relativeFrom="page">
-              <wp:posOffset>2495550</wp:posOffset>
+              <wp:posOffset>5238750</wp:posOffset>
             </wp:positionH>
             <wp:positionV relativeFrom="page">
               <wp:posOffset>8060055</wp:posOffset>
@@ -5800,7 +5800,7 @@
           <wp:anchor distT="0" distB="0" distL="0" distR="0" simplePos="0" relativeHeight="100" behindDoc="1" locked="0" layoutInCell="0" allowOverlap="1">
             <wp:simplePos x="0" y="0"/>
             <wp:positionH relativeFrom="page">
-              <wp:posOffset>254000</wp:posOffset>
+              <wp:posOffset>2997200</wp:posOffset>
             </wp:positionH>
             <wp:positionV relativeFrom="page">
               <wp:posOffset>8616950</wp:posOffset>
@@ -5845,7 +5845,7 @@
           <wp:anchor distT="0" distB="0" distL="0" distR="0" simplePos="0" relativeHeight="101" behindDoc="0" locked="0" layoutInCell="0" allowOverlap="1">
             <wp:simplePos x="0" y="0"/>
             <wp:positionH relativeFrom="page">
-              <wp:posOffset>438150</wp:posOffset>
+              <wp:posOffset>3181350</wp:posOffset>
             </wp:positionH>
             <wp:positionV relativeFrom="page">
               <wp:posOffset>8766175</wp:posOffset>
@@ -5910,7 +5910,7 @@
           <wp:anchor distT="0" distB="0" distL="0" distR="0" simplePos="0" relativeHeight="102" behindDoc="0" locked="0" layoutInCell="0" allowOverlap="1">
             <wp:simplePos x="0" y="0"/>
             <wp:positionH relativeFrom="page">
-              <wp:posOffset>1854200</wp:posOffset>
+              <wp:posOffset>4597400</wp:posOffset>
             </wp:positionH>
             <wp:positionV relativeFrom="page">
               <wp:posOffset>8753475</wp:posOffset>
@@ -6127,7 +6127,7 @@
           <wp:anchor distT="0" distB="0" distL="0" distR="0" simplePos="0" relativeHeight="108" behindDoc="0" locked="0" layoutInCell="0" allowOverlap="1">
             <wp:simplePos x="0" y="0"/>
             <wp:positionH relativeFrom="page">
-              <wp:posOffset>2495550</wp:posOffset>
+              <wp:posOffset>5238750</wp:posOffset>
             </wp:positionH>
             <wp:positionV relativeFrom="page">
               <wp:posOffset>8707755</wp:posOffset>
@@ -6227,7 +6227,7 @@
           <wp:anchor distT="0" distB="0" distL="0" distR="0" simplePos="0" relativeHeight="109" behindDoc="0" locked="0" layoutInCell="0" allowOverlap="1">
             <wp:simplePos x="0" y="0"/>
             <wp:positionH relativeFrom="page">
-              <wp:posOffset>295275</wp:posOffset>
+              <wp:posOffset>3038475</wp:posOffset>
             </wp:positionH>
             <wp:positionV relativeFrom="page">
               <wp:posOffset>9413875</wp:posOffset>
@@ -6491,7 +6491,7 @@
           <wp:anchor distT="0" distB="0" distL="0" distR="0" simplePos="0" relativeHeight="116" behindDoc="1" locked="0" layoutInCell="0" allowOverlap="1">
             <wp:simplePos x="0" y="0"/>
             <wp:positionH relativeFrom="page">
-              <wp:posOffset>768350</wp:posOffset>
+              <wp:posOffset>3511550</wp:posOffset>
             </wp:positionH>
             <wp:positionV relativeFrom="page">
               <wp:posOffset>9423400</wp:posOffset>
@@ -6536,7 +6536,7 @@
           <wp:anchor distT="0" distB="0" distL="0" distR="0" simplePos="0" relativeHeight="117" behindDoc="0" locked="0" layoutInCell="0" allowOverlap="1">
             <wp:simplePos x="0" y="0"/>
             <wp:positionH relativeFrom="page">
-              <wp:posOffset>863600</wp:posOffset>
+              <wp:posOffset>3606800</wp:posOffset>
             </wp:positionH>
             <wp:positionV relativeFrom="page">
               <wp:posOffset>9512300</wp:posOffset>
@@ -6612,7 +6612,7 @@
           <wp:anchor distT="0" distB="0" distL="0" distR="0" simplePos="0" relativeHeight="118" behindDoc="1" locked="0" layoutInCell="0" allowOverlap="1">
             <wp:simplePos x="0" y="0"/>
             <wp:positionH relativeFrom="page">
-              <wp:posOffset>5416550</wp:posOffset>
+              <wp:posOffset>8159750</wp:posOffset>
             </wp:positionH>
             <wp:positionV relativeFrom="page">
               <wp:posOffset>9652000</wp:posOffset>
@@ -6657,7 +6657,7 @@
           <wp:anchor distT="0" distB="0" distL="0" distR="0" simplePos="0" relativeHeight="119" behindDoc="0" locked="0" layoutInCell="0" allowOverlap="1">
             <wp:simplePos x="0" y="0"/>
             <wp:positionH relativeFrom="page">
-              <wp:posOffset>5892800</wp:posOffset>
+              <wp:posOffset>8636000</wp:posOffset>
             </wp:positionH>
             <wp:positionV relativeFrom="page">
               <wp:posOffset>9603740</wp:posOffset>
@@ -6722,7 +6722,7 @@
           <wp:anchor distT="0" distB="0" distL="0" distR="0" simplePos="0" relativeHeight="120" behindDoc="1" locked="0" layoutInCell="0" allowOverlap="1">
             <wp:simplePos x="0" y="0"/>
             <wp:positionH relativeFrom="page">
-              <wp:posOffset>0</wp:posOffset>
+              <wp:posOffset>2743200</wp:posOffset>
             </wp:positionH>
             <wp:positionV relativeFrom="page">
               <wp:posOffset>9848850</wp:posOffset>
@@ -6765,7 +6765,7 @@
           <wp:anchor distT="0" distB="0" distL="0" distR="0" simplePos="0" relativeHeight="121" behindDoc="1" locked="0" layoutInCell="0" allowOverlap="1">
             <wp:simplePos x="0" y="0"/>
             <wp:positionH relativeFrom="page">
-              <wp:posOffset>4826000</wp:posOffset>
+              <wp:posOffset>7569200</wp:posOffset>
             </wp:positionH>
             <wp:positionV relativeFrom="page">
               <wp:posOffset>9848850</wp:posOffset>
@@ -6829,7 +6829,7 @@
           <wp:anchor distT="0" distB="0" distL="0" distR="0" simplePos="0" relativeHeight="122" behindDoc="1" locked="0" layoutInCell="0" allowOverlap="1">
             <wp:simplePos x="0" y="0"/>
             <wp:positionH relativeFrom="page">
-              <wp:posOffset>6350000</wp:posOffset>
+              <wp:posOffset>9093200</wp:posOffset>
             </wp:positionH>
             <wp:positionV relativeFrom="page">
               <wp:posOffset>9848850</wp:posOffset>
@@ -6890,8 +6890,8 @@
       </w:r>
     </w:p>
     <w:sectPr>
-      <w:pgSz w:w="12240" w:h="15840"/>
-      <w:pgMar w:top="160" w:right="160" w:bottom="160" w:left="160" w:header="0" w:footer="0" w:gutter="0"/>
+      <w:pgSz w:w="20880" w:h="15840" w:orient="landscape"/>
+      <w:pgMar w:top="160" w:right="1440" w:bottom="160" w:left="4320" w:header="0" w:footer="0" w:gutter="0"/>
       <w:cols w:space="720"/>
       <w:docGrid w:linePitch="360"/>
     </w:sectPr>

</xml_diff>

<commit_message>
Update agenda format with latest margin-adjusted Word file (#1014)
Co-authored-by: Mike Berry <mikeberry6@Mikes-Mac-mini.local>
</commit_message>
<xml_diff>
--- a/public/one-off-requests/agenda format.docx
+++ b/public/one-off-requests/agenda format.docx
@@ -11,7 +11,7 @@
           <wp:anchor distT="0" distB="0" distL="0" distR="0" simplePos="0" relativeHeight="1" behindDoc="1" locked="0" layoutInCell="0" allowOverlap="1">
             <wp:simplePos x="0" y="0"/>
             <wp:positionH relativeFrom="page">
-              <wp:posOffset>6032500</wp:posOffset>
+              <wp:posOffset>8775700</wp:posOffset>
             </wp:positionH>
             <wp:positionV relativeFrom="page">
               <wp:posOffset>495300</wp:posOffset>
@@ -79,7 +79,7 @@
           <wp:anchor distT="0" distB="0" distL="0" distR="0" simplePos="0" relativeHeight="2" behindDoc="1" locked="0" layoutInCell="0" allowOverlap="1">
             <wp:simplePos x="0" y="0"/>
             <wp:positionH relativeFrom="page">
-              <wp:posOffset>6667500</wp:posOffset>
+              <wp:posOffset>9410700</wp:posOffset>
             </wp:positionH>
             <wp:positionV relativeFrom="page">
               <wp:posOffset>965200</wp:posOffset>
@@ -142,7 +142,7 @@
           <wp:anchor distT="0" distB="0" distL="0" distR="0" simplePos="0" relativeHeight="3" behindDoc="0" locked="0" layoutInCell="0" allowOverlap="1">
             <wp:simplePos x="0" y="0"/>
             <wp:positionH relativeFrom="page">
-              <wp:posOffset>304800</wp:posOffset>
+              <wp:posOffset>3048000</wp:posOffset>
             </wp:positionH>
             <wp:positionV relativeFrom="page">
               <wp:posOffset>191770</wp:posOffset>
@@ -207,7 +207,7 @@
           <wp:anchor distT="0" distB="0" distL="0" distR="0" simplePos="0" relativeHeight="4" behindDoc="1" locked="0" layoutInCell="0" allowOverlap="1">
             <wp:simplePos x="0" y="0"/>
             <wp:positionH relativeFrom="page">
-              <wp:posOffset>2190750</wp:posOffset>
+              <wp:posOffset>4933950</wp:posOffset>
             </wp:positionH>
             <wp:positionV relativeFrom="page">
               <wp:posOffset>243840</wp:posOffset>
@@ -252,7 +252,7 @@
           <wp:anchor distT="0" distB="0" distL="0" distR="0" simplePos="0" relativeHeight="5" behindDoc="0" locked="0" layoutInCell="0" allowOverlap="1">
             <wp:simplePos x="0" y="0"/>
             <wp:positionH relativeFrom="page">
-              <wp:posOffset>5702300</wp:posOffset>
+              <wp:posOffset>8445500</wp:posOffset>
             </wp:positionH>
             <wp:positionV relativeFrom="page">
               <wp:posOffset>191770</wp:posOffset>
@@ -317,7 +317,7 @@
           <wp:anchor distT="0" distB="0" distL="0" distR="0" simplePos="0" relativeHeight="6" behindDoc="0" locked="0" layoutInCell="0" allowOverlap="1">
             <wp:simplePos x="0" y="0"/>
             <wp:positionH relativeFrom="page">
-              <wp:posOffset>342900</wp:posOffset>
+              <wp:posOffset>3086100</wp:posOffset>
             </wp:positionH>
             <wp:positionV relativeFrom="page">
               <wp:posOffset>495300</wp:posOffset>
@@ -381,7 +381,7 @@
           <wp:anchor distT="0" distB="0" distL="0" distR="0" simplePos="0" relativeHeight="7" behindDoc="0" locked="0" layoutInCell="0" allowOverlap="1">
             <wp:simplePos x="0" y="0"/>
             <wp:positionH relativeFrom="page">
-              <wp:posOffset>342900</wp:posOffset>
+              <wp:posOffset>3086100</wp:posOffset>
             </wp:positionH>
             <wp:positionV relativeFrom="page">
               <wp:posOffset>876300</wp:posOffset>
@@ -445,7 +445,7 @@
           <wp:anchor distT="0" distB="0" distL="0" distR="0" simplePos="0" relativeHeight="8" behindDoc="0" locked="0" layoutInCell="0" allowOverlap="1">
             <wp:simplePos x="0" y="0"/>
             <wp:positionH relativeFrom="page">
-              <wp:posOffset>342900</wp:posOffset>
+              <wp:posOffset>3086100</wp:posOffset>
             </wp:positionH>
             <wp:positionV relativeFrom="page">
               <wp:posOffset>1221740</wp:posOffset>
@@ -509,7 +509,7 @@
           <wp:anchor distT="0" distB="0" distL="0" distR="0" simplePos="0" relativeHeight="9" behindDoc="1" locked="0" layoutInCell="0" allowOverlap="1">
             <wp:simplePos x="0" y="0"/>
             <wp:positionH relativeFrom="page">
-              <wp:posOffset>5524500</wp:posOffset>
+              <wp:posOffset>8267700</wp:posOffset>
             </wp:positionH>
             <wp:positionV relativeFrom="page">
               <wp:posOffset>666750</wp:posOffset>
@@ -554,7 +554,7 @@
           <wp:anchor distT="0" distB="0" distL="0" distR="0" simplePos="0" relativeHeight="10" behindDoc="0" locked="0" layoutInCell="0" allowOverlap="1">
             <wp:simplePos x="0" y="0"/>
             <wp:positionH relativeFrom="page">
-              <wp:posOffset>5854700</wp:posOffset>
+              <wp:posOffset>8597900</wp:posOffset>
             </wp:positionH>
             <wp:positionV relativeFrom="page">
               <wp:posOffset>731520</wp:posOffset>
@@ -637,7 +637,7 @@
           <wp:anchor distT="0" distB="0" distL="0" distR="0" simplePos="0" relativeHeight="11" behindDoc="1" locked="0" layoutInCell="0" allowOverlap="1">
             <wp:simplePos x="0" y="0"/>
             <wp:positionH relativeFrom="page">
-              <wp:posOffset>5861050</wp:posOffset>
+              <wp:posOffset>8604250</wp:posOffset>
             </wp:positionH>
             <wp:positionV relativeFrom="page">
               <wp:posOffset>1247140</wp:posOffset>
@@ -682,7 +682,7 @@
           <wp:anchor distT="0" distB="0" distL="0" distR="0" simplePos="0" relativeHeight="12" behindDoc="1" locked="0" layoutInCell="0" allowOverlap="1">
             <wp:simplePos x="0" y="0"/>
             <wp:positionH relativeFrom="page">
-              <wp:posOffset>254000</wp:posOffset>
+              <wp:posOffset>2997200</wp:posOffset>
             </wp:positionH>
             <wp:positionV relativeFrom="page">
               <wp:posOffset>1600200</wp:posOffset>
@@ -727,7 +727,7 @@
           <wp:anchor distT="0" distB="0" distL="0" distR="0" simplePos="0" relativeHeight="13" behindDoc="0" locked="0" layoutInCell="0" allowOverlap="1">
             <wp:simplePos x="0" y="0"/>
             <wp:positionH relativeFrom="page">
-              <wp:posOffset>419100</wp:posOffset>
+              <wp:posOffset>3162300</wp:posOffset>
             </wp:positionH>
             <wp:positionV relativeFrom="page">
               <wp:posOffset>1860550</wp:posOffset>
@@ -812,7 +812,7 @@
           <wp:anchor distT="0" distB="0" distL="0" distR="0" simplePos="0" relativeHeight="14" behindDoc="1" locked="0" layoutInCell="0" allowOverlap="1">
             <wp:simplePos x="0" y="0"/>
             <wp:positionH relativeFrom="page">
-              <wp:posOffset>1898650</wp:posOffset>
+              <wp:posOffset>4641850</wp:posOffset>
             </wp:positionH>
             <wp:positionV relativeFrom="page">
               <wp:posOffset>1733550</wp:posOffset>
@@ -857,7 +857,7 @@
           <wp:anchor distT="0" distB="0" distL="0" distR="0" simplePos="0" relativeHeight="15" behindDoc="1" locked="0" layoutInCell="0" allowOverlap="1">
             <wp:simplePos x="0" y="0"/>
             <wp:positionH relativeFrom="page">
-              <wp:posOffset>3708400</wp:posOffset>
+              <wp:posOffset>6451600</wp:posOffset>
             </wp:positionH>
             <wp:positionV relativeFrom="page">
               <wp:posOffset>1733550</wp:posOffset>
@@ -902,7 +902,7 @@
           <wp:anchor distT="0" distB="0" distL="0" distR="0" simplePos="0" relativeHeight="16" behindDoc="1" locked="0" layoutInCell="0" allowOverlap="1">
             <wp:simplePos x="0" y="0"/>
             <wp:positionH relativeFrom="page">
-              <wp:posOffset>5568950</wp:posOffset>
+              <wp:posOffset>8312150</wp:posOffset>
             </wp:positionH>
             <wp:positionV relativeFrom="page">
               <wp:posOffset>1733550</wp:posOffset>
@@ -947,7 +947,7 @@
           <wp:anchor distT="0" distB="0" distL="0" distR="0" simplePos="0" relativeHeight="17" behindDoc="0" locked="0" layoutInCell="0" allowOverlap="1">
             <wp:simplePos x="0" y="0"/>
             <wp:positionH relativeFrom="page">
-              <wp:posOffset>2019300</wp:posOffset>
+              <wp:posOffset>4762500</wp:posOffset>
             </wp:positionH>
             <wp:positionV relativeFrom="page">
               <wp:posOffset>1604010</wp:posOffset>
@@ -970,7 +970,7 @@
           <wp:anchor distT="0" distB="0" distL="0" distR="0" simplePos="0" relativeHeight="18" behindDoc="0" locked="0" layoutInCell="0" allowOverlap="1">
             <wp:simplePos x="0" y="0"/>
             <wp:positionH relativeFrom="page">
-              <wp:posOffset>2622550</wp:posOffset>
+              <wp:posOffset>5365750</wp:posOffset>
             </wp:positionH>
             <wp:positionV relativeFrom="page">
               <wp:posOffset>1752600</wp:posOffset>
@@ -1053,7 +1053,7 @@
           <wp:anchor distT="0" distB="0" distL="0" distR="0" simplePos="0" relativeHeight="19" behindDoc="0" locked="0" layoutInCell="0" allowOverlap="1">
             <wp:simplePos x="0" y="0"/>
             <wp:positionH relativeFrom="page">
-              <wp:posOffset>2622550</wp:posOffset>
+              <wp:posOffset>5365750</wp:posOffset>
             </wp:positionH>
             <wp:positionV relativeFrom="page">
               <wp:posOffset>2070100</wp:posOffset>
@@ -1117,7 +1117,7 @@
           <wp:anchor distT="0" distB="0" distL="0" distR="0" simplePos="0" relativeHeight="20" behindDoc="0" locked="0" layoutInCell="0" allowOverlap="1">
             <wp:simplePos x="0" y="0"/>
             <wp:positionH relativeFrom="page">
-              <wp:posOffset>3759200</wp:posOffset>
+              <wp:posOffset>6502400</wp:posOffset>
             </wp:positionH>
             <wp:positionV relativeFrom="page">
               <wp:posOffset>1604010</wp:posOffset>
@@ -1140,7 +1140,7 @@
           <wp:anchor distT="0" distB="0" distL="0" distR="0" simplePos="0" relativeHeight="21" behindDoc="0" locked="0" layoutInCell="0" allowOverlap="1">
             <wp:simplePos x="0" y="0"/>
             <wp:positionH relativeFrom="page">
-              <wp:posOffset>4368800</wp:posOffset>
+              <wp:posOffset>7112000</wp:posOffset>
             </wp:positionH>
             <wp:positionV relativeFrom="page">
               <wp:posOffset>1752600</wp:posOffset>
@@ -1223,7 +1223,7 @@
           <wp:anchor distT="0" distB="0" distL="0" distR="0" simplePos="0" relativeHeight="22" behindDoc="0" locked="0" layoutInCell="0" allowOverlap="1">
             <wp:simplePos x="0" y="0"/>
             <wp:positionH relativeFrom="page">
-              <wp:posOffset>4368800</wp:posOffset>
+              <wp:posOffset>7112000</wp:posOffset>
             </wp:positionH>
             <wp:positionV relativeFrom="page">
               <wp:posOffset>2070100</wp:posOffset>
@@ -1288,7 +1288,7 @@
           <wp:anchor distT="0" distB="0" distL="0" distR="0" simplePos="0" relativeHeight="23" behindDoc="0" locked="0" layoutInCell="0" allowOverlap="1">
             <wp:simplePos x="0" y="0"/>
             <wp:positionH relativeFrom="page">
-              <wp:posOffset>5619750</wp:posOffset>
+              <wp:posOffset>8362950</wp:posOffset>
             </wp:positionH>
             <wp:positionV relativeFrom="page">
               <wp:posOffset>1604010</wp:posOffset>
@@ -1311,7 +1311,7 @@
           <wp:anchor distT="0" distB="0" distL="0" distR="0" simplePos="0" relativeHeight="24" behindDoc="0" locked="0" layoutInCell="0" allowOverlap="1">
             <wp:simplePos x="0" y="0"/>
             <wp:positionH relativeFrom="page">
-              <wp:posOffset>6223000</wp:posOffset>
+              <wp:posOffset>8966200</wp:posOffset>
             </wp:positionH>
             <wp:positionV relativeFrom="page">
               <wp:posOffset>1752600</wp:posOffset>
@@ -1394,7 +1394,7 @@
           <wp:anchor distT="0" distB="0" distL="0" distR="0" simplePos="0" relativeHeight="25" behindDoc="0" locked="0" layoutInCell="0" allowOverlap="1">
             <wp:simplePos x="0" y="0"/>
             <wp:positionH relativeFrom="page">
-              <wp:posOffset>6223000</wp:posOffset>
+              <wp:posOffset>8966200</wp:posOffset>
             </wp:positionH>
             <wp:positionV relativeFrom="page">
               <wp:posOffset>2070100</wp:posOffset>
@@ -1458,7 +1458,7 @@
           <wp:anchor distT="0" distB="0" distL="0" distR="0" simplePos="0" relativeHeight="26" behindDoc="1" locked="0" layoutInCell="0" allowOverlap="1">
             <wp:simplePos x="0" y="0"/>
             <wp:positionH relativeFrom="page">
-              <wp:posOffset>254000</wp:posOffset>
+              <wp:posOffset>2997200</wp:posOffset>
             </wp:positionH>
             <wp:positionV relativeFrom="page">
               <wp:posOffset>2514600</wp:posOffset>
@@ -1549,7 +1549,7 @@
           <wp:anchor distT="0" distB="0" distL="0" distR="0" simplePos="0" relativeHeight="27" behindDoc="1" locked="0" layoutInCell="0" allowOverlap="1">
             <wp:simplePos x="0" y="0"/>
             <wp:positionH relativeFrom="page">
-              <wp:posOffset>254000</wp:posOffset>
+              <wp:posOffset>2997200</wp:posOffset>
             </wp:positionH>
             <wp:positionV relativeFrom="page">
               <wp:posOffset>2895600</wp:posOffset>
@@ -1621,7 +1621,7 @@
           <wp:anchor distT="0" distB="0" distL="0" distR="0" simplePos="0" relativeHeight="28" behindDoc="1" locked="0" layoutInCell="0" allowOverlap="1">
             <wp:simplePos x="0" y="0"/>
             <wp:positionH relativeFrom="page">
-              <wp:posOffset>254000</wp:posOffset>
+              <wp:posOffset>2997200</wp:posOffset>
             </wp:positionH>
             <wp:positionV relativeFrom="page">
               <wp:posOffset>2514600</wp:posOffset>
@@ -1698,7 +1698,7 @@
           <wp:anchor distT="0" distB="0" distL="0" distR="0" simplePos="0" relativeHeight="29" behindDoc="0" locked="0" layoutInCell="0" allowOverlap="1">
             <wp:simplePos x="0" y="0"/>
             <wp:positionH relativeFrom="page">
-              <wp:posOffset>482600</wp:posOffset>
+              <wp:posOffset>3225800</wp:posOffset>
             </wp:positionH>
             <wp:positionV relativeFrom="page">
               <wp:posOffset>2606040</wp:posOffset>
@@ -1774,7 +1774,7 @@
           <wp:anchor distT="0" distB="0" distL="0" distR="0" simplePos="0" relativeHeight="30" behindDoc="0" locked="0" layoutInCell="0" allowOverlap="1">
             <wp:simplePos x="0" y="0"/>
             <wp:positionH relativeFrom="page">
-              <wp:posOffset>5664200</wp:posOffset>
+              <wp:posOffset>8407400</wp:posOffset>
             </wp:positionH>
             <wp:positionV relativeFrom="page">
               <wp:posOffset>2630170</wp:posOffset>
@@ -1838,7 +1838,7 @@
           <wp:anchor distT="0" distB="0" distL="0" distR="0" simplePos="0" relativeHeight="31" behindDoc="0" locked="0" layoutInCell="0" allowOverlap="1">
             <wp:simplePos x="0" y="0"/>
             <wp:positionH relativeFrom="page">
-              <wp:posOffset>438150</wp:posOffset>
+              <wp:posOffset>3181350</wp:posOffset>
             </wp:positionH>
             <wp:positionV relativeFrom="page">
               <wp:posOffset>3111500</wp:posOffset>
@@ -1902,7 +1902,7 @@
           <wp:anchor distT="0" distB="0" distL="0" distR="0" simplePos="0" relativeHeight="32" behindDoc="0" locked="0" layoutInCell="0" allowOverlap="1">
             <wp:simplePos x="0" y="0"/>
             <wp:positionH relativeFrom="page">
-              <wp:posOffset>1854200</wp:posOffset>
+              <wp:posOffset>4597400</wp:posOffset>
             </wp:positionH>
             <wp:positionV relativeFrom="page">
               <wp:posOffset>3009900</wp:posOffset>
@@ -2023,7 +2023,7 @@
           <wp:anchor distT="0" distB="0" distL="0" distR="0" simplePos="0" relativeHeight="37" behindDoc="0" locked="0" layoutInCell="0" allowOverlap="1">
             <wp:simplePos x="0" y="0"/>
             <wp:positionH relativeFrom="page">
-              <wp:posOffset>2495550</wp:posOffset>
+              <wp:posOffset>5238750</wp:posOffset>
             </wp:positionH>
             <wp:positionV relativeFrom="page">
               <wp:posOffset>2964180</wp:posOffset>
@@ -2159,7 +2159,7 @@
           <wp:anchor distT="0" distB="0" distL="0" distR="0" simplePos="0" relativeHeight="38" behindDoc="1" locked="0" layoutInCell="0" allowOverlap="1">
             <wp:simplePos x="0" y="0"/>
             <wp:positionH relativeFrom="page">
-              <wp:posOffset>254000</wp:posOffset>
+              <wp:posOffset>2997200</wp:posOffset>
             </wp:positionH>
             <wp:positionV relativeFrom="page">
               <wp:posOffset>3505200</wp:posOffset>
@@ -2204,7 +2204,7 @@
           <wp:anchor distT="0" distB="0" distL="0" distR="0" simplePos="0" relativeHeight="39" behindDoc="0" locked="0" layoutInCell="0" allowOverlap="1">
             <wp:simplePos x="0" y="0"/>
             <wp:positionH relativeFrom="page">
-              <wp:posOffset>438150</wp:posOffset>
+              <wp:posOffset>3181350</wp:posOffset>
             </wp:positionH>
             <wp:positionV relativeFrom="page">
               <wp:posOffset>3813175</wp:posOffset>
@@ -2269,7 +2269,7 @@
           <wp:anchor distT="0" distB="0" distL="0" distR="0" simplePos="0" relativeHeight="40" behindDoc="0" locked="0" layoutInCell="0" allowOverlap="1">
             <wp:simplePos x="0" y="0"/>
             <wp:positionH relativeFrom="page">
-              <wp:posOffset>1854200</wp:posOffset>
+              <wp:posOffset>4597400</wp:posOffset>
             </wp:positionH>
             <wp:positionV relativeFrom="page">
               <wp:posOffset>3800475</wp:posOffset>
@@ -2390,7 +2390,7 @@
           <wp:anchor distT="0" distB="0" distL="0" distR="0" simplePos="0" relativeHeight="45" behindDoc="0" locked="0" layoutInCell="0" allowOverlap="1">
             <wp:simplePos x="0" y="0"/>
             <wp:positionH relativeFrom="page">
-              <wp:posOffset>2495550</wp:posOffset>
+              <wp:posOffset>5238750</wp:posOffset>
             </wp:positionH>
             <wp:positionV relativeFrom="page">
               <wp:posOffset>3602355</wp:posOffset>
@@ -2598,7 +2598,7 @@
           <wp:anchor distT="0" distB="0" distL="0" distR="0" simplePos="0" relativeHeight="46" behindDoc="1" locked="0" layoutInCell="0" allowOverlap="1">
             <wp:simplePos x="0" y="0"/>
             <wp:positionH relativeFrom="page">
-              <wp:posOffset>254000</wp:posOffset>
+              <wp:posOffset>2997200</wp:posOffset>
             </wp:positionH>
             <wp:positionV relativeFrom="page">
               <wp:posOffset>4476750</wp:posOffset>
@@ -2641,7 +2641,7 @@
           <wp:anchor distT="0" distB="0" distL="0" distR="0" simplePos="0" relativeHeight="47" behindDoc="1" locked="0" layoutInCell="0" allowOverlap="1">
             <wp:simplePos x="0" y="0"/>
             <wp:positionH relativeFrom="page">
-              <wp:posOffset>254000</wp:posOffset>
+              <wp:posOffset>2997200</wp:posOffset>
             </wp:positionH>
             <wp:positionV relativeFrom="page">
               <wp:posOffset>4476750</wp:posOffset>
@@ -2684,7 +2684,7 @@
           <wp:anchor distT="0" distB="0" distL="0" distR="0" simplePos="0" relativeHeight="48" behindDoc="1" locked="0" layoutInCell="0" allowOverlap="1">
             <wp:simplePos x="0" y="0"/>
             <wp:positionH relativeFrom="page">
-              <wp:posOffset>254000</wp:posOffset>
+              <wp:posOffset>2997200</wp:posOffset>
             </wp:positionH>
             <wp:positionV relativeFrom="page">
               <wp:posOffset>4476750</wp:posOffset>
@@ -2729,7 +2729,7 @@
           <wp:anchor distT="0" distB="0" distL="0" distR="0" simplePos="0" relativeHeight="49" behindDoc="0" locked="0" layoutInCell="0" allowOverlap="1">
             <wp:simplePos x="0" y="0"/>
             <wp:positionH relativeFrom="page">
-              <wp:posOffset>438150</wp:posOffset>
+              <wp:posOffset>3181350</wp:posOffset>
             </wp:positionH>
             <wp:positionV relativeFrom="page">
               <wp:posOffset>4597400</wp:posOffset>
@@ -2793,7 +2793,7 @@
           <wp:anchor distT="0" distB="0" distL="0" distR="0" simplePos="0" relativeHeight="50" behindDoc="0" locked="0" layoutInCell="0" allowOverlap="1">
             <wp:simplePos x="0" y="0"/>
             <wp:positionH relativeFrom="page">
-              <wp:posOffset>1879600</wp:posOffset>
+              <wp:posOffset>4622800</wp:posOffset>
             </wp:positionH>
             <wp:positionV relativeFrom="page">
               <wp:posOffset>4521200</wp:posOffset>
@@ -2917,7 +2917,7 @@
           <wp:anchor distT="0" distB="0" distL="0" distR="0" simplePos="0" relativeHeight="53" behindDoc="0" locked="0" layoutInCell="0" allowOverlap="1">
             <wp:simplePos x="0" y="0"/>
             <wp:positionH relativeFrom="page">
-              <wp:posOffset>2495550</wp:posOffset>
+              <wp:posOffset>5238750</wp:posOffset>
             </wp:positionH>
             <wp:positionV relativeFrom="page">
               <wp:posOffset>4601210</wp:posOffset>
@@ -2981,7 +2981,7 @@
           <wp:anchor distT="0" distB="0" distL="0" distR="0" simplePos="0" relativeHeight="54" behindDoc="1" locked="0" layoutInCell="0" allowOverlap="1">
             <wp:simplePos x="0" y="0"/>
             <wp:positionH relativeFrom="page">
-              <wp:posOffset>254000</wp:posOffset>
+              <wp:posOffset>2997200</wp:posOffset>
             </wp:positionH>
             <wp:positionV relativeFrom="page">
               <wp:posOffset>4895850</wp:posOffset>
@@ -3026,7 +3026,7 @@
           <wp:anchor distT="0" distB="0" distL="0" distR="0" simplePos="0" relativeHeight="55" behindDoc="0" locked="0" layoutInCell="0" allowOverlap="1">
             <wp:simplePos x="0" y="0"/>
             <wp:positionH relativeFrom="page">
-              <wp:posOffset>438150</wp:posOffset>
+              <wp:posOffset>3181350</wp:posOffset>
             </wp:positionH>
             <wp:positionV relativeFrom="page">
               <wp:posOffset>5226050</wp:posOffset>
@@ -3090,7 +3090,7 @@
           <wp:anchor distT="0" distB="0" distL="0" distR="0" simplePos="0" relativeHeight="56" behindDoc="0" locked="0" layoutInCell="0" allowOverlap="1">
             <wp:simplePos x="0" y="0"/>
             <wp:positionH relativeFrom="page">
-              <wp:posOffset>1854200</wp:posOffset>
+              <wp:posOffset>4597400</wp:posOffset>
             </wp:positionH>
             <wp:positionV relativeFrom="page">
               <wp:posOffset>5124450</wp:posOffset>
@@ -3211,7 +3211,7 @@
           <wp:anchor distT="0" distB="0" distL="0" distR="0" simplePos="0" relativeHeight="61" behindDoc="0" locked="0" layoutInCell="0" allowOverlap="1">
             <wp:simplePos x="0" y="0"/>
             <wp:positionH relativeFrom="page">
-              <wp:posOffset>2495550</wp:posOffset>
+              <wp:posOffset>5238750</wp:posOffset>
             </wp:positionH>
             <wp:positionV relativeFrom="page">
               <wp:posOffset>5002530</wp:posOffset>
@@ -3383,7 +3383,7 @@
           <wp:anchor distT="0" distB="0" distL="0" distR="0" simplePos="0" relativeHeight="62" behindDoc="1" locked="0" layoutInCell="0" allowOverlap="1">
             <wp:simplePos x="0" y="0"/>
             <wp:positionH relativeFrom="page">
-              <wp:posOffset>254000</wp:posOffset>
+              <wp:posOffset>2997200</wp:posOffset>
             </wp:positionH>
             <wp:positionV relativeFrom="page">
               <wp:posOffset>5734050</wp:posOffset>
@@ -3428,7 +3428,7 @@
           <wp:anchor distT="0" distB="0" distL="0" distR="0" simplePos="0" relativeHeight="63" behindDoc="0" locked="0" layoutInCell="0" allowOverlap="1">
             <wp:simplePos x="0" y="0"/>
             <wp:positionH relativeFrom="page">
-              <wp:posOffset>438150</wp:posOffset>
+              <wp:posOffset>3181350</wp:posOffset>
             </wp:positionH>
             <wp:positionV relativeFrom="page">
               <wp:posOffset>5864225</wp:posOffset>
@@ -3492,7 +3492,7 @@
           <wp:anchor distT="0" distB="0" distL="0" distR="0" simplePos="0" relativeHeight="64" behindDoc="0" locked="0" layoutInCell="0" allowOverlap="1">
             <wp:simplePos x="0" y="0"/>
             <wp:positionH relativeFrom="page">
-              <wp:posOffset>1854200</wp:posOffset>
+              <wp:posOffset>4597400</wp:posOffset>
             </wp:positionH>
             <wp:positionV relativeFrom="page">
               <wp:posOffset>5762625</wp:posOffset>
@@ -3748,7 +3748,7 @@
           <wp:anchor distT="0" distB="0" distL="0" distR="0" simplePos="0" relativeHeight="68" behindDoc="0" locked="0" layoutInCell="0" allowOverlap="1">
             <wp:simplePos x="0" y="0"/>
             <wp:positionH relativeFrom="page">
-              <wp:posOffset>2495550</wp:posOffset>
+              <wp:posOffset>5238750</wp:posOffset>
             </wp:positionH>
             <wp:positionV relativeFrom="page">
               <wp:posOffset>5868035</wp:posOffset>
@@ -3812,7 +3812,7 @@
           <wp:anchor distT="0" distB="0" distL="0" distR="0" simplePos="0" relativeHeight="69" behindDoc="1" locked="0" layoutInCell="0" allowOverlap="1">
             <wp:simplePos x="0" y="0"/>
             <wp:positionH relativeFrom="page">
-              <wp:posOffset>254000</wp:posOffset>
+              <wp:posOffset>2997200</wp:posOffset>
             </wp:positionH>
             <wp:positionV relativeFrom="page">
               <wp:posOffset>6172200</wp:posOffset>
@@ -3857,7 +3857,7 @@
           <wp:anchor distT="0" distB="0" distL="0" distR="0" simplePos="0" relativeHeight="70" behindDoc="0" locked="0" layoutInCell="0" allowOverlap="1">
             <wp:simplePos x="0" y="0"/>
             <wp:positionH relativeFrom="page">
-              <wp:posOffset>438150</wp:posOffset>
+              <wp:posOffset>3181350</wp:posOffset>
             </wp:positionH>
             <wp:positionV relativeFrom="page">
               <wp:posOffset>6311900</wp:posOffset>
@@ -3921,7 +3921,7 @@
           <wp:anchor distT="0" distB="0" distL="0" distR="0" simplePos="0" relativeHeight="71" behindDoc="0" locked="0" layoutInCell="0" allowOverlap="1">
             <wp:simplePos x="0" y="0"/>
             <wp:positionH relativeFrom="page">
-              <wp:posOffset>1854200</wp:posOffset>
+              <wp:posOffset>4597400</wp:posOffset>
             </wp:positionH>
             <wp:positionV relativeFrom="page">
               <wp:posOffset>6210300</wp:posOffset>
@@ -4177,7 +4177,7 @@
           <wp:anchor distT="0" distB="0" distL="0" distR="0" simplePos="0" relativeHeight="75" behindDoc="0" locked="0" layoutInCell="0" allowOverlap="1">
             <wp:simplePos x="0" y="0"/>
             <wp:positionH relativeFrom="page">
-              <wp:posOffset>2495550</wp:posOffset>
+              <wp:posOffset>5238750</wp:posOffset>
             </wp:positionH>
             <wp:positionV relativeFrom="page">
               <wp:posOffset>6315710</wp:posOffset>
@@ -4241,7 +4241,7 @@
           <wp:anchor distT="0" distB="0" distL="0" distR="0" simplePos="0" relativeHeight="76" behindDoc="1" locked="0" layoutInCell="0" allowOverlap="1">
             <wp:simplePos x="0" y="0"/>
             <wp:positionH relativeFrom="page">
-              <wp:posOffset>254000</wp:posOffset>
+              <wp:posOffset>2997200</wp:posOffset>
             </wp:positionH>
             <wp:positionV relativeFrom="page">
               <wp:posOffset>6750050</wp:posOffset>
@@ -4332,7 +4332,7 @@
           <wp:anchor distT="0" distB="0" distL="0" distR="0" simplePos="0" relativeHeight="77" behindDoc="1" locked="0" layoutInCell="0" allowOverlap="1">
             <wp:simplePos x="0" y="0"/>
             <wp:positionH relativeFrom="page">
-              <wp:posOffset>254000</wp:posOffset>
+              <wp:posOffset>2997200</wp:posOffset>
             </wp:positionH>
             <wp:positionV relativeFrom="page">
               <wp:posOffset>7131050</wp:posOffset>
@@ -4404,7 +4404,7 @@
           <wp:anchor distT="0" distB="0" distL="0" distR="0" simplePos="0" relativeHeight="78" behindDoc="1" locked="0" layoutInCell="0" allowOverlap="1">
             <wp:simplePos x="0" y="0"/>
             <wp:positionH relativeFrom="page">
-              <wp:posOffset>254000</wp:posOffset>
+              <wp:posOffset>2997200</wp:posOffset>
             </wp:positionH>
             <wp:positionV relativeFrom="page">
               <wp:posOffset>6750050</wp:posOffset>
@@ -4481,7 +4481,7 @@
           <wp:anchor distT="0" distB="0" distL="0" distR="0" simplePos="0" relativeHeight="79" behindDoc="0" locked="0" layoutInCell="0" allowOverlap="1">
             <wp:simplePos x="0" y="0"/>
             <wp:positionH relativeFrom="page">
-              <wp:posOffset>482600</wp:posOffset>
+              <wp:posOffset>3225800</wp:posOffset>
             </wp:positionH>
             <wp:positionV relativeFrom="page">
               <wp:posOffset>6841490</wp:posOffset>
@@ -4557,7 +4557,7 @@
           <wp:anchor distT="0" distB="0" distL="0" distR="0" simplePos="0" relativeHeight="80" behindDoc="0" locked="0" layoutInCell="0" allowOverlap="1">
             <wp:simplePos x="0" y="0"/>
             <wp:positionH relativeFrom="page">
-              <wp:posOffset>5664200</wp:posOffset>
+              <wp:posOffset>8407400</wp:posOffset>
             </wp:positionH>
             <wp:positionV relativeFrom="page">
               <wp:posOffset>6865620</wp:posOffset>
@@ -4621,7 +4621,7 @@
           <wp:anchor distT="0" distB="0" distL="0" distR="0" simplePos="0" relativeHeight="81" behindDoc="0" locked="0" layoutInCell="0" allowOverlap="1">
             <wp:simplePos x="0" y="0"/>
             <wp:positionH relativeFrom="page">
-              <wp:posOffset>438150</wp:posOffset>
+              <wp:posOffset>3181350</wp:posOffset>
             </wp:positionH>
             <wp:positionV relativeFrom="page">
               <wp:posOffset>7254875</wp:posOffset>
@@ -4685,7 +4685,7 @@
           <wp:anchor distT="0" distB="0" distL="0" distR="0" simplePos="0" relativeHeight="82" behindDoc="0" locked="0" layoutInCell="0" allowOverlap="1">
             <wp:simplePos x="0" y="0"/>
             <wp:positionH relativeFrom="page">
-              <wp:posOffset>1854200</wp:posOffset>
+              <wp:posOffset>4597400</wp:posOffset>
             </wp:positionH>
             <wp:positionV relativeFrom="page">
               <wp:posOffset>7153275</wp:posOffset>
@@ -4941,7 +4941,7 @@
           <wp:anchor distT="0" distB="0" distL="0" distR="0" simplePos="0" relativeHeight="86" behindDoc="0" locked="0" layoutInCell="0" allowOverlap="1">
             <wp:simplePos x="0" y="0"/>
             <wp:positionH relativeFrom="page">
-              <wp:posOffset>2495550</wp:posOffset>
+              <wp:posOffset>5238750</wp:posOffset>
             </wp:positionH>
             <wp:positionV relativeFrom="page">
               <wp:posOffset>7258685</wp:posOffset>
@@ -5005,7 +5005,7 @@
           <wp:anchor distT="0" distB="0" distL="0" distR="0" simplePos="0" relativeHeight="87" behindDoc="1" locked="0" layoutInCell="0" allowOverlap="1">
             <wp:simplePos x="0" y="0"/>
             <wp:positionH relativeFrom="page">
-              <wp:posOffset>254000</wp:posOffset>
+              <wp:posOffset>2997200</wp:posOffset>
             </wp:positionH>
             <wp:positionV relativeFrom="page">
               <wp:posOffset>7556500</wp:posOffset>
@@ -5050,7 +5050,7 @@
           <wp:anchor distT="0" distB="0" distL="0" distR="0" simplePos="0" relativeHeight="88" behindDoc="0" locked="0" layoutInCell="0" allowOverlap="1">
             <wp:simplePos x="0" y="0"/>
             <wp:positionH relativeFrom="page">
-              <wp:posOffset>438150</wp:posOffset>
+              <wp:posOffset>3181350</wp:posOffset>
             </wp:positionH>
             <wp:positionV relativeFrom="page">
               <wp:posOffset>7677150</wp:posOffset>
@@ -5114,7 +5114,7 @@
           <wp:anchor distT="0" distB="0" distL="0" distR="0" simplePos="0" relativeHeight="89" behindDoc="0" locked="0" layoutInCell="0" allowOverlap="1">
             <wp:simplePos x="0" y="0"/>
             <wp:positionH relativeFrom="page">
-              <wp:posOffset>1854200</wp:posOffset>
+              <wp:posOffset>4597400</wp:posOffset>
             </wp:positionH>
             <wp:positionV relativeFrom="page">
               <wp:posOffset>7575550</wp:posOffset>
@@ -5370,7 +5370,7 @@
           <wp:anchor distT="0" distB="0" distL="0" distR="0" simplePos="0" relativeHeight="93" behindDoc="0" locked="0" layoutInCell="0" allowOverlap="1">
             <wp:simplePos x="0" y="0"/>
             <wp:positionH relativeFrom="page">
-              <wp:posOffset>2495550</wp:posOffset>
+              <wp:posOffset>5238750</wp:posOffset>
             </wp:positionH>
             <wp:positionV relativeFrom="page">
               <wp:posOffset>7680960</wp:posOffset>
@@ -5434,7 +5434,7 @@
           <wp:anchor distT="0" distB="0" distL="0" distR="0" simplePos="0" relativeHeight="94" behindDoc="1" locked="0" layoutInCell="0" allowOverlap="1">
             <wp:simplePos x="0" y="0"/>
             <wp:positionH relativeFrom="page">
-              <wp:posOffset>254000</wp:posOffset>
+              <wp:posOffset>2997200</wp:posOffset>
             </wp:positionH>
             <wp:positionV relativeFrom="page">
               <wp:posOffset>7975600</wp:posOffset>
@@ -5479,7 +5479,7 @@
           <wp:anchor distT="0" distB="0" distL="0" distR="0" simplePos="0" relativeHeight="95" behindDoc="0" locked="0" layoutInCell="0" allowOverlap="1">
             <wp:simplePos x="0" y="0"/>
             <wp:positionH relativeFrom="page">
-              <wp:posOffset>438150</wp:posOffset>
+              <wp:posOffset>3181350</wp:posOffset>
             </wp:positionH>
             <wp:positionV relativeFrom="page">
               <wp:posOffset>8207375</wp:posOffset>
@@ -5543,7 +5543,7 @@
           <wp:anchor distT="0" distB="0" distL="0" distR="0" simplePos="0" relativeHeight="96" behindDoc="0" locked="0" layoutInCell="0" allowOverlap="1">
             <wp:simplePos x="0" y="0"/>
             <wp:positionH relativeFrom="page">
-              <wp:posOffset>1854200</wp:posOffset>
+              <wp:posOffset>4597400</wp:posOffset>
             </wp:positionH>
             <wp:positionV relativeFrom="page">
               <wp:posOffset>8105775</wp:posOffset>
@@ -5664,7 +5664,7 @@
           <wp:anchor distT="0" distB="0" distL="0" distR="0" simplePos="0" relativeHeight="99" behindDoc="0" locked="0" layoutInCell="0" allowOverlap="1">
             <wp:simplePos x="0" y="0"/>
             <wp:positionH relativeFrom="page">
-              <wp:posOffset>2495550</wp:posOffset>
+              <wp:posOffset>5238750</wp:posOffset>
             </wp:positionH>
             <wp:positionV relativeFrom="page">
               <wp:posOffset>8060055</wp:posOffset>
@@ -5800,7 +5800,7 @@
           <wp:anchor distT="0" distB="0" distL="0" distR="0" simplePos="0" relativeHeight="100" behindDoc="1" locked="0" layoutInCell="0" allowOverlap="1">
             <wp:simplePos x="0" y="0"/>
             <wp:positionH relativeFrom="page">
-              <wp:posOffset>254000</wp:posOffset>
+              <wp:posOffset>2997200</wp:posOffset>
             </wp:positionH>
             <wp:positionV relativeFrom="page">
               <wp:posOffset>8616950</wp:posOffset>
@@ -5845,7 +5845,7 @@
           <wp:anchor distT="0" distB="0" distL="0" distR="0" simplePos="0" relativeHeight="101" behindDoc="0" locked="0" layoutInCell="0" allowOverlap="1">
             <wp:simplePos x="0" y="0"/>
             <wp:positionH relativeFrom="page">
-              <wp:posOffset>438150</wp:posOffset>
+              <wp:posOffset>3181350</wp:posOffset>
             </wp:positionH>
             <wp:positionV relativeFrom="page">
               <wp:posOffset>8766175</wp:posOffset>
@@ -5910,7 +5910,7 @@
           <wp:anchor distT="0" distB="0" distL="0" distR="0" simplePos="0" relativeHeight="102" behindDoc="0" locked="0" layoutInCell="0" allowOverlap="1">
             <wp:simplePos x="0" y="0"/>
             <wp:positionH relativeFrom="page">
-              <wp:posOffset>1854200</wp:posOffset>
+              <wp:posOffset>4597400</wp:posOffset>
             </wp:positionH>
             <wp:positionV relativeFrom="page">
               <wp:posOffset>8753475</wp:posOffset>
@@ -6127,7 +6127,7 @@
           <wp:anchor distT="0" distB="0" distL="0" distR="0" simplePos="0" relativeHeight="108" behindDoc="0" locked="0" layoutInCell="0" allowOverlap="1">
             <wp:simplePos x="0" y="0"/>
             <wp:positionH relativeFrom="page">
-              <wp:posOffset>2495550</wp:posOffset>
+              <wp:posOffset>5238750</wp:posOffset>
             </wp:positionH>
             <wp:positionV relativeFrom="page">
               <wp:posOffset>8707755</wp:posOffset>
@@ -6227,7 +6227,7 @@
           <wp:anchor distT="0" distB="0" distL="0" distR="0" simplePos="0" relativeHeight="109" behindDoc="0" locked="0" layoutInCell="0" allowOverlap="1">
             <wp:simplePos x="0" y="0"/>
             <wp:positionH relativeFrom="page">
-              <wp:posOffset>295275</wp:posOffset>
+              <wp:posOffset>3038475</wp:posOffset>
             </wp:positionH>
             <wp:positionV relativeFrom="page">
               <wp:posOffset>9413875</wp:posOffset>
@@ -6491,7 +6491,7 @@
           <wp:anchor distT="0" distB="0" distL="0" distR="0" simplePos="0" relativeHeight="116" behindDoc="1" locked="0" layoutInCell="0" allowOverlap="1">
             <wp:simplePos x="0" y="0"/>
             <wp:positionH relativeFrom="page">
-              <wp:posOffset>768350</wp:posOffset>
+              <wp:posOffset>3511550</wp:posOffset>
             </wp:positionH>
             <wp:positionV relativeFrom="page">
               <wp:posOffset>9423400</wp:posOffset>
@@ -6536,7 +6536,7 @@
           <wp:anchor distT="0" distB="0" distL="0" distR="0" simplePos="0" relativeHeight="117" behindDoc="0" locked="0" layoutInCell="0" allowOverlap="1">
             <wp:simplePos x="0" y="0"/>
             <wp:positionH relativeFrom="page">
-              <wp:posOffset>863600</wp:posOffset>
+              <wp:posOffset>3606800</wp:posOffset>
             </wp:positionH>
             <wp:positionV relativeFrom="page">
               <wp:posOffset>9512300</wp:posOffset>
@@ -6612,7 +6612,7 @@
           <wp:anchor distT="0" distB="0" distL="0" distR="0" simplePos="0" relativeHeight="118" behindDoc="1" locked="0" layoutInCell="0" allowOverlap="1">
             <wp:simplePos x="0" y="0"/>
             <wp:positionH relativeFrom="page">
-              <wp:posOffset>5416550</wp:posOffset>
+              <wp:posOffset>8159750</wp:posOffset>
             </wp:positionH>
             <wp:positionV relativeFrom="page">
               <wp:posOffset>9652000</wp:posOffset>
@@ -6657,7 +6657,7 @@
           <wp:anchor distT="0" distB="0" distL="0" distR="0" simplePos="0" relativeHeight="119" behindDoc="0" locked="0" layoutInCell="0" allowOverlap="1">
             <wp:simplePos x="0" y="0"/>
             <wp:positionH relativeFrom="page">
-              <wp:posOffset>5892800</wp:posOffset>
+              <wp:posOffset>8636000</wp:posOffset>
             </wp:positionH>
             <wp:positionV relativeFrom="page">
               <wp:posOffset>9603740</wp:posOffset>
@@ -6722,7 +6722,7 @@
           <wp:anchor distT="0" distB="0" distL="0" distR="0" simplePos="0" relativeHeight="120" behindDoc="1" locked="0" layoutInCell="0" allowOverlap="1">
             <wp:simplePos x="0" y="0"/>
             <wp:positionH relativeFrom="page">
-              <wp:posOffset>0</wp:posOffset>
+              <wp:posOffset>2743200</wp:posOffset>
             </wp:positionH>
             <wp:positionV relativeFrom="page">
               <wp:posOffset>9848850</wp:posOffset>
@@ -6765,7 +6765,7 @@
           <wp:anchor distT="0" distB="0" distL="0" distR="0" simplePos="0" relativeHeight="121" behindDoc="1" locked="0" layoutInCell="0" allowOverlap="1">
             <wp:simplePos x="0" y="0"/>
             <wp:positionH relativeFrom="page">
-              <wp:posOffset>4826000</wp:posOffset>
+              <wp:posOffset>7569200</wp:posOffset>
             </wp:positionH>
             <wp:positionV relativeFrom="page">
               <wp:posOffset>9848850</wp:posOffset>
@@ -6829,7 +6829,7 @@
           <wp:anchor distT="0" distB="0" distL="0" distR="0" simplePos="0" relativeHeight="122" behindDoc="1" locked="0" layoutInCell="0" allowOverlap="1">
             <wp:simplePos x="0" y="0"/>
             <wp:positionH relativeFrom="page">
-              <wp:posOffset>6350000</wp:posOffset>
+              <wp:posOffset>9093200</wp:posOffset>
             </wp:positionH>
             <wp:positionV relativeFrom="page">
               <wp:posOffset>9848850</wp:posOffset>
@@ -6890,8 +6890,8 @@
       </w:r>
     </w:p>
     <w:sectPr>
-      <w:pgSz w:w="12240" w:h="15840"/>
-      <w:pgMar w:top="160" w:right="160" w:bottom="160" w:left="160" w:header="0" w:footer="0" w:gutter="0"/>
+      <w:pgSz w:w="20880" w:h="15840" w:orient="landscape"/>
+      <w:pgMar w:top="160" w:right="1440" w:bottom="160" w:left="4320" w:header="0" w:footer="0" w:gutter="0"/>
       <w:cols w:space="720"/>
       <w:docGrid w:linePitch="360"/>
     </w:sectPr>

</xml_diff>